<commit_message>
Atualização automática da planilha (2026-09-16)
</commit_message>
<xml_diff>
--- a/doc2.docx
+++ b/doc2.docx
@@ -93,6 +93,8 @@
           <w:rtl w:val="0"/>
         </w:rPr>
         <w:t xml:space="preserve">Da pra completar com Shiny Smeargle do Elemento</w:t>
+        <w:br w:type="textWrapping"/>
+        <w:t xml:space="preserve">Da pra usar CASTFORM também</w:t>
       </w:r>
     </w:p>
     <w:p>
@@ -215,6 +217,404 @@
         <w:rPr>
           <w:rtl w:val="0"/>
         </w:rPr>
+        <w:t xml:space="preserve">Shiny Hitmonchan OFFTANK</w:t>
+        <w:tab/>
+        <w:t xml:space="preserve"> - T1</w:t>
+      </w:r>
+    </w:p>
+    <w:p>
+      <w:pPr>
+        <w:rPr/>
+      </w:pPr>
+      <w:r>
+        <w:rPr>
+          <w:rtl w:val="0"/>
+        </w:rPr>
+        <w:t xml:space="preserve">Shiny Cacturne off tank - T1</w:t>
+      </w:r>
+    </w:p>
+    <w:p>
+      <w:pPr>
+        <w:rPr/>
+      </w:pPr>
+      <w:r>
+        <w:rPr>
+          <w:rtl w:val="0"/>
+        </w:rPr>
+        <w:t xml:space="preserve">Shiny Umbreon - T1</w:t>
+      </w:r>
+    </w:p>
+    <w:p>
+      <w:pPr>
+        <w:rPr/>
+      </w:pPr>
+      <w:r>
+        <w:rPr>
+          <w:rtl w:val="0"/>
+        </w:rPr>
+        <w:t xml:space="preserve">Dusknoir - T1</w:t>
+      </w:r>
+    </w:p>
+    <w:p>
+      <w:pPr>
+        <w:rPr/>
+      </w:pPr>
+      <w:r>
+        <w:rPr>
+          <w:rtl w:val="0"/>
+        </w:rPr>
+        <w:t xml:space="preserve">Shiny Tauros - SR</w:t>
+      </w:r>
+    </w:p>
+    <w:p>
+      <w:pPr>
+        <w:rPr/>
+      </w:pPr>
+      <w:r>
+        <w:rPr>
+          <w:rtl w:val="0"/>
+        </w:rPr>
+        <w:t xml:space="preserve">Shiny Msdreavuss - SR</w:t>
+      </w:r>
+    </w:p>
+    <w:p>
+      <w:pPr>
+        <w:rPr/>
+      </w:pPr>
+      <w:r>
+        <w:rPr>
+          <w:rtl w:val="0"/>
+        </w:rPr>
+        <w:t xml:space="preserve">Shiny Hydregon - SR</w:t>
+      </w:r>
+    </w:p>
+    <w:p>
+      <w:pPr>
+        <w:rPr/>
+      </w:pPr>
+      <w:r>
+        <w:rPr>
+          <w:rtl w:val="0"/>
+        </w:rPr>
+        <w:t xml:space="preserve">SHINY SABLEYE OFFT T1</w:t>
+      </w:r>
+    </w:p>
+    <w:p>
+      <w:pPr>
+        <w:rPr/>
+      </w:pPr>
+      <w:r>
+        <w:rPr>
+          <w:rtl w:val="0"/>
+        </w:rPr>
+        <w:tab/>
+      </w:r>
+    </w:p>
+    <w:p>
+      <w:pPr>
+        <w:rPr/>
+      </w:pPr>
+      <w:r>
+        <w:rPr>
+          <w:rtl w:val="0"/>
+        </w:rPr>
+        <w:t xml:space="preserve">SHINY XEDINJA GOST T1</w:t>
+      </w:r>
+    </w:p>
+    <w:p>
+      <w:pPr>
+        <w:rPr/>
+      </w:pPr>
+      <w:r>
+        <w:rPr>
+          <w:rtl w:val="0"/>
+        </w:rPr>
+      </w:r>
+    </w:p>
+    <w:p>
+      <w:pPr>
+        <w:rPr/>
+      </w:pPr>
+      <w:r>
+        <w:rPr>
+          <w:rtl w:val="0"/>
+        </w:rPr>
+      </w:r>
+    </w:p>
+    <w:p>
+      <w:pPr>
+        <w:rPr/>
+      </w:pPr>
+      <w:r>
+        <w:rPr>
+          <w:rtl w:val="0"/>
+        </w:rPr>
+        <w:t xml:space="preserve">Time inicial: ELETRICO</w:t>
+      </w:r>
+    </w:p>
+    <w:p>
+      <w:pPr>
+        <w:rPr/>
+      </w:pPr>
+      <w:r>
+        <w:rPr>
+          <w:rtl w:val="0"/>
+        </w:rPr>
+      </w:r>
+    </w:p>
+    <w:p>
+      <w:pPr>
+        <w:rPr/>
+      </w:pPr>
+      <w:r>
+        <w:rPr>
+          <w:rtl w:val="0"/>
+        </w:rPr>
+        <w:t xml:space="preserve">Luxray (Offtank) - T1</w:t>
+      </w:r>
+    </w:p>
+    <w:p>
+      <w:pPr>
+        <w:rPr/>
+      </w:pPr>
+      <w:r>
+        <w:rPr>
+          <w:rtl w:val="0"/>
+        </w:rPr>
+        <w:t xml:space="preserve">Shiny Raichu - T1 </w:t>
+      </w:r>
+    </w:p>
+    <w:p>
+      <w:pPr>
+        <w:rPr/>
+      </w:pPr>
+      <w:r>
+        <w:rPr>
+          <w:rtl w:val="0"/>
+        </w:rPr>
+        <w:t xml:space="preserve">Shiny Ampharos - T1 OFF TANK</w:t>
+      </w:r>
+    </w:p>
+    <w:p>
+      <w:pPr>
+        <w:rPr/>
+      </w:pPr>
+      <w:r>
+        <w:rPr>
+          <w:rtl w:val="0"/>
+        </w:rPr>
+        <w:t xml:space="preserve">Shiny Jolteon - T1</w:t>
+      </w:r>
+    </w:p>
+    <w:p>
+      <w:pPr>
+        <w:rPr/>
+      </w:pPr>
+      <w:r>
+        <w:rPr>
+          <w:rtl w:val="0"/>
+        </w:rPr>
+        <w:t xml:space="preserve">Shiny Luxray (Offtank) - SR</w:t>
+      </w:r>
+    </w:p>
+    <w:p>
+      <w:pPr>
+        <w:rPr/>
+      </w:pPr>
+      <w:r>
+        <w:rPr>
+          <w:rtl w:val="0"/>
+        </w:rPr>
+        <w:t xml:space="preserve">Shiny Pachirisu (Offtank) - SR</w:t>
+      </w:r>
+    </w:p>
+    <w:p>
+      <w:pPr>
+        <w:rPr/>
+      </w:pPr>
+      <w:r>
+        <w:rPr>
+          <w:rtl w:val="0"/>
+        </w:rPr>
+      </w:r>
+    </w:p>
+    <w:p>
+      <w:pPr>
+        <w:rPr/>
+      </w:pPr>
+      <w:r>
+        <w:rPr>
+          <w:rtl w:val="0"/>
+        </w:rPr>
+      </w:r>
+    </w:p>
+    <w:p>
+      <w:pPr>
+        <w:rPr/>
+      </w:pPr>
+      <w:r>
+        <w:rPr>
+          <w:rtl w:val="0"/>
+        </w:rPr>
+      </w:r>
+    </w:p>
+    <w:p>
+      <w:pPr>
+        <w:rPr/>
+      </w:pPr>
+      <w:r>
+        <w:rPr>
+          <w:rtl w:val="0"/>
+        </w:rPr>
+        <w:t xml:space="preserve">Time inicial: FADA  (FALTA POKE PRA FECHAR BONITINHO)</w:t>
+      </w:r>
+    </w:p>
+    <w:p>
+      <w:pPr>
+        <w:rPr/>
+      </w:pPr>
+      <w:r>
+        <w:rPr>
+          <w:rtl w:val="0"/>
+        </w:rPr>
+      </w:r>
+    </w:p>
+    <w:p>
+      <w:pPr>
+        <w:rPr/>
+      </w:pPr>
+      <w:r>
+        <w:rPr>
+          <w:rtl w:val="0"/>
+        </w:rPr>
+        <w:t xml:space="preserve">Mega Clefable (Offtank) - T1</w:t>
+      </w:r>
+    </w:p>
+    <w:p>
+      <w:pPr>
+        <w:rPr/>
+      </w:pPr>
+      <w:r>
+        <w:rPr>
+          <w:rtl w:val="0"/>
+        </w:rPr>
+        <w:t xml:space="preserve">Shiny Mimikyu (Offtank) - SR</w:t>
+      </w:r>
+    </w:p>
+    <w:p>
+      <w:pPr>
+        <w:rPr/>
+      </w:pPr>
+      <w:r>
+        <w:rPr>
+          <w:rtl w:val="0"/>
+        </w:rPr>
+        <w:t xml:space="preserve">Shiny Florges (Offtank) - SR</w:t>
+      </w:r>
+    </w:p>
+    <w:p>
+      <w:pPr>
+        <w:rPr/>
+      </w:pPr>
+      <w:r>
+        <w:rPr>
+          <w:rtl w:val="0"/>
+        </w:rPr>
+        <w:t xml:space="preserve">Shiny Decalty - t1</w:t>
+      </w:r>
+    </w:p>
+    <w:p>
+      <w:pPr>
+        <w:rPr/>
+      </w:pPr>
+      <w:r>
+        <w:rPr>
+          <w:rtl w:val="0"/>
+        </w:rPr>
+        <w:t xml:space="preserve">Shiny Granbull 2 Stars (Offtank) - T2</w:t>
+      </w:r>
+    </w:p>
+    <w:p>
+      <w:pPr>
+        <w:rPr/>
+      </w:pPr>
+      <w:r>
+        <w:rPr>
+          <w:rtl w:val="0"/>
+        </w:rPr>
+        <w:t xml:space="preserve">Shiny Wigglytuff 2 Stars - T2</w:t>
+      </w:r>
+    </w:p>
+    <w:p>
+      <w:pPr>
+        <w:rPr/>
+      </w:pPr>
+      <w:r>
+        <w:rPr>
+          <w:rtl w:val="0"/>
+        </w:rPr>
+      </w:r>
+    </w:p>
+    <w:p>
+      <w:pPr>
+        <w:rPr/>
+      </w:pPr>
+      <w:r>
+        <w:rPr>
+          <w:rtl w:val="0"/>
+        </w:rPr>
+      </w:r>
+    </w:p>
+    <w:p>
+      <w:pPr>
+        <w:rPr/>
+      </w:pPr>
+      <w:r>
+        <w:rPr>
+          <w:rtl w:val="0"/>
+        </w:rPr>
+      </w:r>
+    </w:p>
+    <w:p>
+      <w:pPr>
+        <w:rPr/>
+      </w:pPr>
+      <w:r>
+        <w:rPr>
+          <w:rtl w:val="0"/>
+        </w:rPr>
+        <w:t xml:space="preserve">Time inicial: lutador</w:t>
+      </w:r>
+    </w:p>
+    <w:p>
+      <w:pPr>
+        <w:rPr/>
+      </w:pPr>
+      <w:r>
+        <w:rPr>
+          <w:rtl w:val="0"/>
+        </w:rPr>
+      </w:r>
+    </w:p>
+    <w:p>
+      <w:pPr>
+        <w:rPr/>
+      </w:pPr>
+      <w:r>
+        <w:rPr>
+          <w:rtl w:val="0"/>
+        </w:rPr>
+        <w:t xml:space="preserve">Shiny Hitmontop (Offtank) - T1</w:t>
+      </w:r>
+    </w:p>
+    <w:p>
+      <w:pPr>
+        <w:rPr/>
+      </w:pPr>
+      <w:r>
+        <w:rPr>
+          <w:rtl w:val="0"/>
+        </w:rPr>
         <w:t xml:space="preserve">Shiny Hitmonchan - T1</w:t>
       </w:r>
     </w:p>
@@ -226,359 +626,604 @@
         <w:rPr>
           <w:rtl w:val="0"/>
         </w:rPr>
-        <w:t xml:space="preserve">Shiny Cacturne - T1</w:t>
-      </w:r>
-    </w:p>
-    <w:p>
-      <w:pPr>
-        <w:rPr/>
-      </w:pPr>
-      <w:r>
-        <w:rPr>
-          <w:rtl w:val="0"/>
-        </w:rPr>
-        <w:t xml:space="preserve">Shiny Umbreon - T1</w:t>
-      </w:r>
-    </w:p>
-    <w:p>
-      <w:pPr>
-        <w:rPr/>
-      </w:pPr>
-      <w:r>
-        <w:rPr>
-          <w:rtl w:val="0"/>
-        </w:rPr>
-        <w:t xml:space="preserve">Dusknoir - T1</w:t>
-      </w:r>
-    </w:p>
-    <w:p>
-      <w:pPr>
-        <w:rPr/>
-      </w:pPr>
-      <w:r>
-        <w:rPr>
-          <w:rtl w:val="0"/>
-        </w:rPr>
-        <w:t xml:space="preserve">Shiny Tauros - SR</w:t>
-      </w:r>
-    </w:p>
-    <w:p>
-      <w:pPr>
-        <w:rPr/>
-      </w:pPr>
-      <w:r>
-        <w:rPr>
-          <w:rtl w:val="0"/>
-        </w:rPr>
-        <w:t xml:space="preserve">Shiny Hydregon - SR</w:t>
-      </w:r>
-    </w:p>
-    <w:p>
-      <w:pPr>
-        <w:rPr/>
-      </w:pPr>
-      <w:r>
-        <w:rPr>
-          <w:rtl w:val="0"/>
-        </w:rPr>
-        <w:tab/>
-      </w:r>
-    </w:p>
-    <w:p>
-      <w:pPr>
-        <w:rPr/>
-      </w:pPr>
-      <w:r>
-        <w:rPr>
-          <w:rtl w:val="0"/>
-        </w:rPr>
-        <w:t xml:space="preserve">SHINY XEDINJA GOST T1</w:t>
-      </w:r>
-    </w:p>
-    <w:p>
-      <w:pPr>
-        <w:rPr/>
-      </w:pPr>
-      <w:r>
-        <w:rPr>
-          <w:rtl w:val="0"/>
-        </w:rPr>
-      </w:r>
-    </w:p>
-    <w:p>
-      <w:pPr>
-        <w:rPr/>
-      </w:pPr>
-      <w:r>
-        <w:rPr>
-          <w:rtl w:val="0"/>
-        </w:rPr>
-      </w:r>
-    </w:p>
-    <w:p>
-      <w:pPr>
-        <w:rPr/>
-      </w:pPr>
-      <w:r>
-        <w:rPr>
-          <w:rtl w:val="0"/>
-        </w:rPr>
-        <w:t xml:space="preserve">Time inicial: ELETRICO</w:t>
-      </w:r>
-    </w:p>
-    <w:p>
-      <w:pPr>
-        <w:rPr/>
-      </w:pPr>
-      <w:r>
-        <w:rPr>
-          <w:rtl w:val="0"/>
-        </w:rPr>
-      </w:r>
-    </w:p>
-    <w:p>
-      <w:pPr>
-        <w:rPr/>
-      </w:pPr>
-      <w:r>
-        <w:rPr>
-          <w:rtl w:val="0"/>
-        </w:rPr>
-        <w:t xml:space="preserve">Luxray (Offtank) - T1</w:t>
-      </w:r>
-    </w:p>
-    <w:p>
-      <w:pPr>
-        <w:rPr/>
-      </w:pPr>
-      <w:r>
-        <w:rPr>
-          <w:rtl w:val="0"/>
-        </w:rPr>
-        <w:t xml:space="preserve">Shiny Raichu - T1 </w:t>
-      </w:r>
-    </w:p>
-    <w:p>
-      <w:pPr>
-        <w:rPr/>
-      </w:pPr>
-      <w:r>
-        <w:rPr>
-          <w:rtl w:val="0"/>
-        </w:rPr>
-        <w:t xml:space="preserve">Shiny Ampharos - T1 OFF TANK</w:t>
-      </w:r>
-    </w:p>
-    <w:p>
-      <w:pPr>
-        <w:rPr/>
-      </w:pPr>
-      <w:r>
-        <w:rPr>
-          <w:rtl w:val="0"/>
-        </w:rPr>
-        <w:t xml:space="preserve">Shiny Jolteon - T1</w:t>
-      </w:r>
-    </w:p>
-    <w:p>
-      <w:pPr>
-        <w:rPr/>
-      </w:pPr>
-      <w:r>
-        <w:rPr>
-          <w:rtl w:val="0"/>
-        </w:rPr>
-        <w:t xml:space="preserve">Shiny Luxray (Offtank) - SR</w:t>
-      </w:r>
-    </w:p>
-    <w:p>
-      <w:pPr>
-        <w:rPr/>
-      </w:pPr>
-      <w:r>
-        <w:rPr>
-          <w:rtl w:val="0"/>
-        </w:rPr>
-        <w:t xml:space="preserve">Shiny Pachirisu (Offtank) - SR</w:t>
-      </w:r>
-    </w:p>
-    <w:p>
-      <w:pPr>
-        <w:rPr/>
-      </w:pPr>
-      <w:r>
-        <w:rPr>
-          <w:rtl w:val="0"/>
-        </w:rPr>
-      </w:r>
-    </w:p>
-    <w:p>
-      <w:pPr>
-        <w:rPr/>
-      </w:pPr>
-      <w:r>
-        <w:rPr>
-          <w:rtl w:val="0"/>
-        </w:rPr>
-      </w:r>
-    </w:p>
-    <w:p>
-      <w:pPr>
-        <w:rPr/>
-      </w:pPr>
-      <w:r>
-        <w:rPr>
-          <w:rtl w:val="0"/>
-        </w:rPr>
-      </w:r>
-    </w:p>
-    <w:p>
-      <w:pPr>
-        <w:rPr/>
-      </w:pPr>
-      <w:r>
-        <w:rPr>
-          <w:rtl w:val="0"/>
-        </w:rPr>
-        <w:t xml:space="preserve">Time inicial: FADA</w:t>
-      </w:r>
-    </w:p>
-    <w:p>
-      <w:pPr>
-        <w:rPr/>
-      </w:pPr>
-      <w:r>
-        <w:rPr>
-          <w:rtl w:val="0"/>
-        </w:rPr>
-      </w:r>
-    </w:p>
-    <w:p>
-      <w:pPr>
-        <w:rPr/>
-      </w:pPr>
-      <w:r>
-        <w:rPr>
-          <w:rtl w:val="0"/>
-        </w:rPr>
-        <w:t xml:space="preserve">Mega Clefable (Offtank) - T1</w:t>
-      </w:r>
-    </w:p>
-    <w:p>
-      <w:pPr>
-        <w:rPr/>
-      </w:pPr>
-      <w:r>
-        <w:rPr>
-          <w:rtl w:val="0"/>
-        </w:rPr>
-        <w:t xml:space="preserve">Shiny Mimikyu (Offtank) - SR</w:t>
-      </w:r>
-    </w:p>
-    <w:p>
-      <w:pPr>
-        <w:rPr/>
-      </w:pPr>
-      <w:r>
-        <w:rPr>
-          <w:rtl w:val="0"/>
-        </w:rPr>
-        <w:t xml:space="preserve">Shiny Florges (Offtank) - SR</w:t>
-      </w:r>
-    </w:p>
-    <w:p>
-      <w:pPr>
-        <w:rPr/>
-      </w:pPr>
-      <w:r>
-        <w:rPr>
-          <w:rtl w:val="0"/>
-        </w:rPr>
-        <w:t xml:space="preserve">Shiny Decalty - t1</w:t>
-      </w:r>
-    </w:p>
-    <w:p>
-      <w:pPr>
-        <w:rPr/>
-      </w:pPr>
-      <w:r>
-        <w:rPr>
-          <w:rtl w:val="0"/>
-        </w:rPr>
-        <w:t xml:space="preserve">Shiny Granbull 2 Stars (Offtank) - T2</w:t>
-      </w:r>
-    </w:p>
-    <w:p>
-      <w:pPr>
-        <w:rPr/>
-      </w:pPr>
-      <w:r>
-        <w:rPr>
-          <w:rtl w:val="0"/>
-        </w:rPr>
-        <w:t xml:space="preserve">Shiny Wigglytuff 2 Stars - T2</w:t>
-      </w:r>
-    </w:p>
-    <w:p>
-      <w:pPr>
-        <w:rPr/>
-      </w:pPr>
-      <w:r>
-        <w:rPr>
-          <w:rtl w:val="0"/>
-        </w:rPr>
-      </w:r>
-    </w:p>
-    <w:p>
-      <w:pPr>
-        <w:rPr/>
-      </w:pPr>
-      <w:r>
-        <w:rPr>
-          <w:rtl w:val="0"/>
-        </w:rPr>
-      </w:r>
-    </w:p>
-    <w:p>
-      <w:pPr>
-        <w:rPr/>
-      </w:pPr>
-      <w:r>
-        <w:rPr>
-          <w:rtl w:val="0"/>
-        </w:rPr>
-      </w:r>
-    </w:p>
-    <w:p>
-      <w:pPr>
-        <w:rPr/>
-      </w:pPr>
-      <w:r>
-        <w:rPr>
-          <w:rtl w:val="0"/>
-        </w:rPr>
-        <w:t xml:space="preserve">Time inicial: lutador</w:t>
-      </w:r>
-    </w:p>
-    <w:p>
-      <w:pPr>
-        <w:rPr/>
-      </w:pPr>
-      <w:r>
-        <w:rPr>
-          <w:rtl w:val="0"/>
-        </w:rPr>
-      </w:r>
-    </w:p>
-    <w:p>
-      <w:pPr>
-        <w:rPr/>
-      </w:pPr>
-      <w:r>
-        <w:rPr>
-          <w:rtl w:val="0"/>
-        </w:rPr>
-        <w:t xml:space="preserve">Shiny Hitmontop (Offtank) - T1</w:t>
+        <w:t xml:space="preserve">Shiny Poliwrath (Offtank) - T1</w:t>
+      </w:r>
+    </w:p>
+    <w:p>
+      <w:pPr>
+        <w:rPr/>
+      </w:pPr>
+      <w:r>
+        <w:rPr>
+          <w:rtl w:val="0"/>
+        </w:rPr>
+        <w:t xml:space="preserve">Shiny Machamp (Offtank) - SR</w:t>
+      </w:r>
+    </w:p>
+    <w:p>
+      <w:pPr>
+        <w:rPr/>
+      </w:pPr>
+      <w:r>
+        <w:rPr>
+          <w:rtl w:val="0"/>
+        </w:rPr>
+        <w:t xml:space="preserve">Shiny Kangaskhan - SR</w:t>
+      </w:r>
+    </w:p>
+    <w:p>
+      <w:pPr>
+        <w:rPr/>
+      </w:pPr>
+      <w:r>
+        <w:rPr>
+          <w:rtl w:val="0"/>
+        </w:rPr>
+        <w:t xml:space="preserve">Shiny Hariyama (Offtank) - T1</w:t>
+      </w:r>
+    </w:p>
+    <w:p>
+      <w:pPr>
+        <w:rPr/>
+      </w:pPr>
+      <w:r>
+        <w:rPr>
+          <w:rtl w:val="0"/>
+        </w:rPr>
+      </w:r>
+    </w:p>
+    <w:p>
+      <w:pPr>
+        <w:rPr/>
+      </w:pPr>
+      <w:r>
+        <w:rPr>
+          <w:rtl w:val="0"/>
+        </w:rPr>
+      </w:r>
+    </w:p>
+    <w:p>
+      <w:pPr>
+        <w:rPr/>
+      </w:pPr>
+      <w:r>
+        <w:rPr>
+          <w:rtl w:val="0"/>
+        </w:rPr>
+      </w:r>
+    </w:p>
+    <w:p>
+      <w:pPr>
+        <w:rPr/>
+      </w:pPr>
+      <w:r>
+        <w:rPr>
+          <w:rtl w:val="0"/>
+        </w:rPr>
+        <w:t xml:space="preserve">Time inicial: FIRE</w:t>
+      </w:r>
+    </w:p>
+    <w:p>
+      <w:pPr>
+        <w:rPr/>
+      </w:pPr>
+      <w:r>
+        <w:rPr>
+          <w:rtl w:val="0"/>
+        </w:rPr>
+      </w:r>
+    </w:p>
+    <w:p>
+      <w:pPr>
+        <w:rPr/>
+      </w:pPr>
+      <w:r>
+        <w:rPr>
+          <w:rtl w:val="0"/>
+        </w:rPr>
+        <w:t xml:space="preserve">Shiny Ninetales - T1</w:t>
+      </w:r>
+    </w:p>
+    <w:p>
+      <w:pPr>
+        <w:rPr/>
+      </w:pPr>
+      <w:r>
+        <w:rPr>
+          <w:rtl w:val="0"/>
+        </w:rPr>
+        <w:t xml:space="preserve">Shiny Rapidash (Offtank) - T1</w:t>
+      </w:r>
+    </w:p>
+    <w:p>
+      <w:pPr>
+        <w:rPr/>
+      </w:pPr>
+      <w:r>
+        <w:rPr>
+          <w:rtl w:val="0"/>
+        </w:rPr>
+        <w:t xml:space="preserve">Shiny Typhlosion (Offtank) - T1</w:t>
+      </w:r>
+    </w:p>
+    <w:p>
+      <w:pPr>
+        <w:rPr/>
+      </w:pPr>
+      <w:r>
+        <w:rPr>
+          <w:rtl w:val="0"/>
+        </w:rPr>
+        <w:t xml:space="preserve">Shiny Charizard - T1</w:t>
+      </w:r>
+    </w:p>
+    <w:p>
+      <w:pPr>
+        <w:rPr/>
+      </w:pPr>
+      <w:r>
+        <w:rPr>
+          <w:rtl w:val="0"/>
+        </w:rPr>
+        <w:t xml:space="preserve">Shiny Infernape - SR</w:t>
+      </w:r>
+    </w:p>
+    <w:p>
+      <w:pPr>
+        <w:rPr/>
+      </w:pPr>
+      <w:r>
+        <w:rPr>
+          <w:rtl w:val="0"/>
+        </w:rPr>
+        <w:t xml:space="preserve">Shiny Arcanine (Offtank) - SR</w:t>
+      </w:r>
+    </w:p>
+    <w:p>
+      <w:pPr>
+        <w:rPr/>
+      </w:pPr>
+      <w:r>
+        <w:rPr>
+          <w:rtl w:val="0"/>
+        </w:rPr>
+        <w:t xml:space="preserve"> </w:t>
+      </w:r>
+    </w:p>
+    <w:p>
+      <w:pPr>
+        <w:rPr/>
+      </w:pPr>
+      <w:r>
+        <w:rPr>
+          <w:rtl w:val="0"/>
+        </w:rPr>
+      </w:r>
+    </w:p>
+    <w:p>
+      <w:pPr>
+        <w:rPr/>
+      </w:pPr>
+      <w:r>
+        <w:rPr>
+          <w:rtl w:val="0"/>
+        </w:rPr>
+      </w:r>
+    </w:p>
+    <w:p>
+      <w:pPr>
+        <w:rPr/>
+      </w:pPr>
+      <w:r>
+        <w:rPr>
+          <w:rtl w:val="0"/>
+        </w:rPr>
+        <w:t xml:space="preserve">Time inicial: VOADOR</w:t>
+      </w:r>
+    </w:p>
+    <w:p>
+      <w:pPr>
+        <w:rPr/>
+      </w:pPr>
+      <w:r>
+        <w:rPr>
+          <w:rtl w:val="0"/>
+        </w:rPr>
+      </w:r>
+    </w:p>
+    <w:p>
+      <w:pPr>
+        <w:rPr/>
+      </w:pPr>
+      <w:r>
+        <w:rPr>
+          <w:rtl w:val="0"/>
+        </w:rPr>
+        <w:t xml:space="preserve">Shiny Pidgeot (Offtank) - T1</w:t>
+      </w:r>
+    </w:p>
+    <w:p>
+      <w:pPr>
+        <w:rPr/>
+      </w:pPr>
+      <w:r>
+        <w:rPr>
+          <w:rtl w:val="0"/>
+        </w:rPr>
+        <w:t xml:space="preserve">Shiny Farfetch'd - T1</w:t>
+      </w:r>
+    </w:p>
+    <w:p>
+      <w:pPr>
+        <w:rPr/>
+      </w:pPr>
+      <w:r>
+        <w:rPr>
+          <w:rtl w:val="0"/>
+        </w:rPr>
+        <w:t xml:space="preserve">Shiny Mantine (Offtank) - T1</w:t>
+      </w:r>
+    </w:p>
+    <w:p>
+      <w:pPr>
+        <w:rPr/>
+      </w:pPr>
+      <w:r>
+        <w:rPr>
+          <w:rtl w:val="0"/>
+        </w:rPr>
+        <w:t xml:space="preserve">Shiny Dodrio - T1</w:t>
+      </w:r>
+    </w:p>
+    <w:p>
+      <w:pPr>
+        <w:rPr/>
+      </w:pPr>
+      <w:r>
+        <w:rPr>
+          <w:rtl w:val="0"/>
+        </w:rPr>
+        <w:t xml:space="preserve">Shiny Swellow - SR</w:t>
+      </w:r>
+    </w:p>
+    <w:p>
+      <w:pPr>
+        <w:rPr/>
+      </w:pPr>
+      <w:r>
+        <w:rPr>
+          <w:rtl w:val="0"/>
+        </w:rPr>
+        <w:t xml:space="preserve">Shiny Gliscor (Offtank) - SR</w:t>
+      </w:r>
+    </w:p>
+    <w:p>
+      <w:pPr>
+        <w:rPr/>
+      </w:pPr>
+      <w:r>
+        <w:rPr>
+          <w:rtl w:val="0"/>
+        </w:rPr>
+      </w:r>
+    </w:p>
+    <w:p>
+      <w:pPr>
+        <w:rPr/>
+      </w:pPr>
+      <w:r>
+        <w:rPr>
+          <w:rtl w:val="0"/>
+        </w:rPr>
+        <w:t xml:space="preserve">testar ninjask e marquerain</w:t>
+      </w:r>
+    </w:p>
+    <w:p>
+      <w:pPr>
+        <w:rPr/>
+      </w:pPr>
+      <w:r>
+        <w:rPr>
+          <w:rtl w:val="0"/>
+        </w:rPr>
+      </w:r>
+    </w:p>
+    <w:p>
+      <w:pPr>
+        <w:rPr/>
+      </w:pPr>
+      <w:r>
+        <w:rPr>
+          <w:rtl w:val="0"/>
+        </w:rPr>
+      </w:r>
+    </w:p>
+    <w:p>
+      <w:pPr>
+        <w:rPr/>
+      </w:pPr>
+      <w:r>
+        <w:rPr>
+          <w:rtl w:val="0"/>
+        </w:rPr>
+        <w:t xml:space="preserve">Time inicial: GRAMA (TEM VARIOS DE HOEN Q DA PRA USAR AINDA)</w:t>
+      </w:r>
+    </w:p>
+    <w:p>
+      <w:pPr>
+        <w:rPr/>
+      </w:pPr>
+      <w:r>
+        <w:rPr>
+          <w:rtl w:val="0"/>
+        </w:rPr>
+      </w:r>
+    </w:p>
+    <w:p>
+      <w:pPr>
+        <w:rPr/>
+      </w:pPr>
+      <w:r>
+        <w:rPr>
+          <w:rtl w:val="0"/>
+        </w:rPr>
+        <w:t xml:space="preserve">Tangrowth (Offtank) - T1</w:t>
+      </w:r>
+    </w:p>
+    <w:p>
+      <w:pPr>
+        <w:rPr/>
+      </w:pPr>
+      <w:r>
+        <w:rPr>
+          <w:rtl w:val="0"/>
+        </w:rPr>
+        <w:t xml:space="preserve">Gogoat (Offtank) - T1</w:t>
+      </w:r>
+    </w:p>
+    <w:p>
+      <w:pPr>
+        <w:rPr/>
+      </w:pPr>
+      <w:r>
+        <w:rPr>
+          <w:rtl w:val="0"/>
+        </w:rPr>
+        <w:t xml:space="preserve">Shiny Venusaur (Offtank) - T1</w:t>
+      </w:r>
+    </w:p>
+    <w:p>
+      <w:pPr>
+        <w:rPr/>
+      </w:pPr>
+      <w:r>
+        <w:rPr>
+          <w:rtl w:val="0"/>
+        </w:rPr>
+        <w:t xml:space="preserve">Shiny Meganium (Offtank) - T1</w:t>
+      </w:r>
+    </w:p>
+    <w:p>
+      <w:pPr>
+        <w:rPr/>
+      </w:pPr>
+      <w:r>
+        <w:rPr>
+          <w:rtl w:val="0"/>
+        </w:rPr>
+        <w:t xml:space="preserve">Shiny Tangrowth (Offtank) - SR</w:t>
+      </w:r>
+    </w:p>
+    <w:p>
+      <w:pPr>
+        <w:rPr/>
+      </w:pPr>
+      <w:r>
+        <w:rPr>
+          <w:rtl w:val="0"/>
+        </w:rPr>
+        <w:t xml:space="preserve">Shiny Gogoat (Offtank) - SR</w:t>
+      </w:r>
+    </w:p>
+    <w:p>
+      <w:pPr>
+        <w:rPr/>
+      </w:pPr>
+      <w:r>
+        <w:rPr>
+          <w:rtl w:val="0"/>
+        </w:rPr>
+        <w:t xml:space="preserve">s cradilly, s roselia, s shiftry etc todos t1 </w:t>
+      </w:r>
+    </w:p>
+    <w:p>
+      <w:pPr>
+        <w:rPr/>
+      </w:pPr>
+      <w:r>
+        <w:rPr>
+          <w:rtl w:val="0"/>
+        </w:rPr>
+      </w:r>
+    </w:p>
+    <w:p>
+      <w:pPr>
+        <w:rPr/>
+      </w:pPr>
+      <w:r>
+        <w:rPr>
+          <w:rtl w:val="0"/>
+        </w:rPr>
+      </w:r>
+    </w:p>
+    <w:p>
+      <w:pPr>
+        <w:rPr/>
+      </w:pPr>
+      <w:r>
+        <w:rPr>
+          <w:rtl w:val="0"/>
+        </w:rPr>
+      </w:r>
+    </w:p>
+    <w:p>
+      <w:pPr>
+        <w:rPr/>
+      </w:pPr>
+      <w:r>
+        <w:rPr>
+          <w:rtl w:val="0"/>
+        </w:rPr>
+      </w:r>
+    </w:p>
+    <w:p>
+      <w:pPr>
+        <w:rPr/>
+      </w:pPr>
+      <w:r>
+        <w:rPr>
+          <w:rtl w:val="0"/>
+        </w:rPr>
+        <w:t xml:space="preserve">Time inicial: TERRAAA</w:t>
+      </w:r>
+    </w:p>
+    <w:p>
+      <w:pPr>
+        <w:rPr/>
+      </w:pPr>
+      <w:r>
+        <w:rPr>
+          <w:rtl w:val="0"/>
+        </w:rPr>
+      </w:r>
+    </w:p>
+    <w:p>
+      <w:pPr>
+        <w:rPr/>
+      </w:pPr>
+      <w:r>
+        <w:rPr>
+          <w:rtl w:val="0"/>
+        </w:rPr>
+        <w:t xml:space="preserve">Shiny Steelix (Offtank) - T1</w:t>
+      </w:r>
+    </w:p>
+    <w:p>
+      <w:pPr>
+        <w:rPr/>
+      </w:pPr>
+      <w:r>
+        <w:rPr>
+          <w:rtl w:val="0"/>
+        </w:rPr>
+        <w:t xml:space="preserve">Torterra - T1</w:t>
+      </w:r>
+    </w:p>
+    <w:p>
+      <w:pPr>
+        <w:rPr/>
+      </w:pPr>
+      <w:r>
+        <w:rPr>
+          <w:rtl w:val="0"/>
+        </w:rPr>
+        <w:t xml:space="preserve">Shiny Camerupt - T1</w:t>
+      </w:r>
+    </w:p>
+    <w:p>
+      <w:pPr>
+        <w:rPr/>
+      </w:pPr>
+      <w:r>
+        <w:rPr>
+          <w:rtl w:val="0"/>
+        </w:rPr>
+        <w:t xml:space="preserve">Shiny Whiscash - T1</w:t>
+      </w:r>
+    </w:p>
+    <w:p>
+      <w:pPr>
+        <w:rPr/>
+      </w:pPr>
+      <w:r>
+        <w:rPr>
+          <w:rtl w:val="0"/>
+        </w:rPr>
+        <w:t xml:space="preserve">Shiny Torterra - SR</w:t>
+      </w:r>
+    </w:p>
+    <w:p>
+      <w:pPr>
+        <w:rPr/>
+      </w:pPr>
+      <w:r>
+        <w:rPr>
+          <w:rtl w:val="0"/>
+        </w:rPr>
+        <w:t xml:space="preserve">Shiny Pupitar - SR</w:t>
+      </w:r>
+    </w:p>
+    <w:p>
+      <w:pPr>
+        <w:rPr/>
+      </w:pPr>
+      <w:r>
+        <w:rPr>
+          <w:rtl w:val="0"/>
+        </w:rPr>
+      </w:r>
+    </w:p>
+    <w:p>
+      <w:pPr>
+        <w:rPr/>
+      </w:pPr>
+      <w:r>
+        <w:rPr>
+          <w:rtl w:val="0"/>
+        </w:rPr>
+      </w:r>
+    </w:p>
+    <w:p>
+      <w:pPr>
+        <w:rPr/>
+      </w:pPr>
+      <w:r>
+        <w:rPr>
+          <w:rtl w:val="0"/>
+        </w:rPr>
+        <w:t xml:space="preserve">GELO  (é ruim) </w:t>
+      </w:r>
+    </w:p>
+    <w:p>
+      <w:pPr>
+        <w:rPr/>
+      </w:pPr>
+      <w:r>
+        <w:rPr>
+          <w:rtl w:val="0"/>
+        </w:rPr>
+      </w:r>
+    </w:p>
+    <w:p>
+      <w:pPr>
+        <w:rPr/>
+      </w:pPr>
+      <w:r>
+        <w:rPr>
+          <w:rtl w:val="0"/>
+        </w:rPr>
+        <w:t xml:space="preserve">Shiny Lapras (Offtank) - T1</w:t>
+      </w:r>
+    </w:p>
+    <w:p>
+      <w:pPr>
+        <w:rPr/>
+      </w:pPr>
+      <w:r>
+        <w:rPr>
+          <w:rtl w:val="0"/>
+        </w:rPr>
+        <w:t xml:space="preserve">Shiny Jynx - T1</w:t>
       </w:r>
     </w:p>
     <w:p>
@@ -600,604 +1245,6 @@
         <w:rPr>
           <w:rtl w:val="0"/>
         </w:rPr>
-        <w:t xml:space="preserve">Shiny Poliwrath (Offtank) - T1</w:t>
-      </w:r>
-    </w:p>
-    <w:p>
-      <w:pPr>
-        <w:rPr/>
-      </w:pPr>
-      <w:r>
-        <w:rPr>
-          <w:rtl w:val="0"/>
-        </w:rPr>
-        <w:t xml:space="preserve">Shiny Machamp (Offtank) - SR</w:t>
-      </w:r>
-    </w:p>
-    <w:p>
-      <w:pPr>
-        <w:rPr/>
-      </w:pPr>
-      <w:r>
-        <w:rPr>
-          <w:rtl w:val="0"/>
-        </w:rPr>
-        <w:t xml:space="preserve">Shiny Kangaskhan - SR</w:t>
-      </w:r>
-    </w:p>
-    <w:p>
-      <w:pPr>
-        <w:rPr/>
-      </w:pPr>
-      <w:r>
-        <w:rPr>
-          <w:rtl w:val="0"/>
-        </w:rPr>
-        <w:t xml:space="preserve">Shiny Hariyama (Offtank) - T1</w:t>
-      </w:r>
-    </w:p>
-    <w:p>
-      <w:pPr>
-        <w:rPr/>
-      </w:pPr>
-      <w:r>
-        <w:rPr>
-          <w:rtl w:val="0"/>
-        </w:rPr>
-      </w:r>
-    </w:p>
-    <w:p>
-      <w:pPr>
-        <w:rPr/>
-      </w:pPr>
-      <w:r>
-        <w:rPr>
-          <w:rtl w:val="0"/>
-        </w:rPr>
-      </w:r>
-    </w:p>
-    <w:p>
-      <w:pPr>
-        <w:rPr/>
-      </w:pPr>
-      <w:r>
-        <w:rPr>
-          <w:rtl w:val="0"/>
-        </w:rPr>
-      </w:r>
-    </w:p>
-    <w:p>
-      <w:pPr>
-        <w:rPr/>
-      </w:pPr>
-      <w:r>
-        <w:rPr>
-          <w:rtl w:val="0"/>
-        </w:rPr>
-        <w:t xml:space="preserve">Time inicial: FIRE</w:t>
-      </w:r>
-    </w:p>
-    <w:p>
-      <w:pPr>
-        <w:rPr/>
-      </w:pPr>
-      <w:r>
-        <w:rPr>
-          <w:rtl w:val="0"/>
-        </w:rPr>
-      </w:r>
-    </w:p>
-    <w:p>
-      <w:pPr>
-        <w:rPr/>
-      </w:pPr>
-      <w:r>
-        <w:rPr>
-          <w:rtl w:val="0"/>
-        </w:rPr>
-        <w:t xml:space="preserve">Shiny Ninetales - T1</w:t>
-      </w:r>
-    </w:p>
-    <w:p>
-      <w:pPr>
-        <w:rPr/>
-      </w:pPr>
-      <w:r>
-        <w:rPr>
-          <w:rtl w:val="0"/>
-        </w:rPr>
-        <w:t xml:space="preserve">Shiny Rapidash (Offtank) - T1</w:t>
-      </w:r>
-    </w:p>
-    <w:p>
-      <w:pPr>
-        <w:rPr/>
-      </w:pPr>
-      <w:r>
-        <w:rPr>
-          <w:rtl w:val="0"/>
-        </w:rPr>
-        <w:t xml:space="preserve">Shiny Typhlosion (Offtank) - T1</w:t>
-      </w:r>
-    </w:p>
-    <w:p>
-      <w:pPr>
-        <w:rPr/>
-      </w:pPr>
-      <w:r>
-        <w:rPr>
-          <w:rtl w:val="0"/>
-        </w:rPr>
-        <w:t xml:space="preserve">Shiny Charizard - T1</w:t>
-      </w:r>
-    </w:p>
-    <w:p>
-      <w:pPr>
-        <w:rPr/>
-      </w:pPr>
-      <w:r>
-        <w:rPr>
-          <w:rtl w:val="0"/>
-        </w:rPr>
-        <w:t xml:space="preserve">Shiny Infernape - SR</w:t>
-      </w:r>
-    </w:p>
-    <w:p>
-      <w:pPr>
-        <w:rPr/>
-      </w:pPr>
-      <w:r>
-        <w:rPr>
-          <w:rtl w:val="0"/>
-        </w:rPr>
-        <w:t xml:space="preserve">Shiny Arcanine (Offtank) - SR</w:t>
-      </w:r>
-    </w:p>
-    <w:p>
-      <w:pPr>
-        <w:rPr/>
-      </w:pPr>
-      <w:r>
-        <w:rPr>
-          <w:rtl w:val="0"/>
-        </w:rPr>
-        <w:t xml:space="preserve"> </w:t>
-      </w:r>
-    </w:p>
-    <w:p>
-      <w:pPr>
-        <w:rPr/>
-      </w:pPr>
-      <w:r>
-        <w:rPr>
-          <w:rtl w:val="0"/>
-        </w:rPr>
-      </w:r>
-    </w:p>
-    <w:p>
-      <w:pPr>
-        <w:rPr/>
-      </w:pPr>
-      <w:r>
-        <w:rPr>
-          <w:rtl w:val="0"/>
-        </w:rPr>
-      </w:r>
-    </w:p>
-    <w:p>
-      <w:pPr>
-        <w:rPr/>
-      </w:pPr>
-      <w:r>
-        <w:rPr>
-          <w:rtl w:val="0"/>
-        </w:rPr>
-        <w:t xml:space="preserve">Time inicial: VOADOR</w:t>
-      </w:r>
-    </w:p>
-    <w:p>
-      <w:pPr>
-        <w:rPr/>
-      </w:pPr>
-      <w:r>
-        <w:rPr>
-          <w:rtl w:val="0"/>
-        </w:rPr>
-      </w:r>
-    </w:p>
-    <w:p>
-      <w:pPr>
-        <w:rPr/>
-      </w:pPr>
-      <w:r>
-        <w:rPr>
-          <w:rtl w:val="0"/>
-        </w:rPr>
-        <w:t xml:space="preserve">Shiny Pidgeot (Offtank) - T1</w:t>
-      </w:r>
-    </w:p>
-    <w:p>
-      <w:pPr>
-        <w:rPr/>
-      </w:pPr>
-      <w:r>
-        <w:rPr>
-          <w:rtl w:val="0"/>
-        </w:rPr>
-        <w:t xml:space="preserve">Shiny Farfetch'd - T1</w:t>
-      </w:r>
-    </w:p>
-    <w:p>
-      <w:pPr>
-        <w:rPr/>
-      </w:pPr>
-      <w:r>
-        <w:rPr>
-          <w:rtl w:val="0"/>
-        </w:rPr>
-        <w:t xml:space="preserve">Shiny Mantine (Offtank) - T1</w:t>
-      </w:r>
-    </w:p>
-    <w:p>
-      <w:pPr>
-        <w:rPr/>
-      </w:pPr>
-      <w:r>
-        <w:rPr>
-          <w:rtl w:val="0"/>
-        </w:rPr>
-        <w:t xml:space="preserve">Shiny Dodrio - T1</w:t>
-      </w:r>
-    </w:p>
-    <w:p>
-      <w:pPr>
-        <w:rPr/>
-      </w:pPr>
-      <w:r>
-        <w:rPr>
-          <w:rtl w:val="0"/>
-        </w:rPr>
-        <w:t xml:space="preserve">Shiny Swellow - SR</w:t>
-      </w:r>
-    </w:p>
-    <w:p>
-      <w:pPr>
-        <w:rPr/>
-      </w:pPr>
-      <w:r>
-        <w:rPr>
-          <w:rtl w:val="0"/>
-        </w:rPr>
-        <w:t xml:space="preserve">Shiny Gliscor (Offtank) - SR</w:t>
-      </w:r>
-    </w:p>
-    <w:p>
-      <w:pPr>
-        <w:rPr/>
-      </w:pPr>
-      <w:r>
-        <w:rPr>
-          <w:rtl w:val="0"/>
-        </w:rPr>
-      </w:r>
-    </w:p>
-    <w:p>
-      <w:pPr>
-        <w:rPr/>
-      </w:pPr>
-      <w:r>
-        <w:rPr>
-          <w:rtl w:val="0"/>
-        </w:rPr>
-        <w:t xml:space="preserve">testar ninjask e marquerain</w:t>
-      </w:r>
-    </w:p>
-    <w:p>
-      <w:pPr>
-        <w:rPr/>
-      </w:pPr>
-      <w:r>
-        <w:rPr>
-          <w:rtl w:val="0"/>
-        </w:rPr>
-      </w:r>
-    </w:p>
-    <w:p>
-      <w:pPr>
-        <w:rPr/>
-      </w:pPr>
-      <w:r>
-        <w:rPr>
-          <w:rtl w:val="0"/>
-        </w:rPr>
-      </w:r>
-    </w:p>
-    <w:p>
-      <w:pPr>
-        <w:rPr/>
-      </w:pPr>
-      <w:r>
-        <w:rPr>
-          <w:rtl w:val="0"/>
-        </w:rPr>
-        <w:t xml:space="preserve">Time inicial: GRAMA</w:t>
-      </w:r>
-    </w:p>
-    <w:p>
-      <w:pPr>
-        <w:rPr/>
-      </w:pPr>
-      <w:r>
-        <w:rPr>
-          <w:rtl w:val="0"/>
-        </w:rPr>
-      </w:r>
-    </w:p>
-    <w:p>
-      <w:pPr>
-        <w:rPr/>
-      </w:pPr>
-      <w:r>
-        <w:rPr>
-          <w:rtl w:val="0"/>
-        </w:rPr>
-        <w:t xml:space="preserve">Tangrowth (Offtank) - T1</w:t>
-      </w:r>
-    </w:p>
-    <w:p>
-      <w:pPr>
-        <w:rPr/>
-      </w:pPr>
-      <w:r>
-        <w:rPr>
-          <w:rtl w:val="0"/>
-        </w:rPr>
-        <w:t xml:space="preserve">Gogoat (Offtank) - T1</w:t>
-      </w:r>
-    </w:p>
-    <w:p>
-      <w:pPr>
-        <w:rPr/>
-      </w:pPr>
-      <w:r>
-        <w:rPr>
-          <w:rtl w:val="0"/>
-        </w:rPr>
-        <w:t xml:space="preserve">Shiny Venusaur (Offtank) - T1</w:t>
-      </w:r>
-    </w:p>
-    <w:p>
-      <w:pPr>
-        <w:rPr/>
-      </w:pPr>
-      <w:r>
-        <w:rPr>
-          <w:rtl w:val="0"/>
-        </w:rPr>
-        <w:t xml:space="preserve">Shiny Meganium (Offtank) - T1</w:t>
-      </w:r>
-    </w:p>
-    <w:p>
-      <w:pPr>
-        <w:rPr/>
-      </w:pPr>
-      <w:r>
-        <w:rPr>
-          <w:rtl w:val="0"/>
-        </w:rPr>
-        <w:t xml:space="preserve">Shiny Tangrowth (Offtank) - SR</w:t>
-      </w:r>
-    </w:p>
-    <w:p>
-      <w:pPr>
-        <w:rPr/>
-      </w:pPr>
-      <w:r>
-        <w:rPr>
-          <w:rtl w:val="0"/>
-        </w:rPr>
-        <w:t xml:space="preserve">Shiny Gogoat (Offtank) - SR</w:t>
-      </w:r>
-    </w:p>
-    <w:p>
-      <w:pPr>
-        <w:rPr/>
-      </w:pPr>
-      <w:r>
-        <w:rPr>
-          <w:rtl w:val="0"/>
-        </w:rPr>
-      </w:r>
-    </w:p>
-    <w:p>
-      <w:pPr>
-        <w:rPr/>
-      </w:pPr>
-      <w:r>
-        <w:rPr>
-          <w:rtl w:val="0"/>
-        </w:rPr>
-      </w:r>
-    </w:p>
-    <w:p>
-      <w:pPr>
-        <w:rPr/>
-      </w:pPr>
-      <w:r>
-        <w:rPr>
-          <w:rtl w:val="0"/>
-        </w:rPr>
-      </w:r>
-    </w:p>
-    <w:p>
-      <w:pPr>
-        <w:rPr/>
-      </w:pPr>
-      <w:r>
-        <w:rPr>
-          <w:rtl w:val="0"/>
-        </w:rPr>
-        <w:t xml:space="preserve">Time inicial: TERRAAA</w:t>
-      </w:r>
-    </w:p>
-    <w:p>
-      <w:pPr>
-        <w:rPr/>
-      </w:pPr>
-      <w:r>
-        <w:rPr>
-          <w:rtl w:val="0"/>
-        </w:rPr>
-      </w:r>
-    </w:p>
-    <w:p>
-      <w:pPr>
-        <w:rPr/>
-      </w:pPr>
-      <w:r>
-        <w:rPr>
-          <w:rtl w:val="0"/>
-        </w:rPr>
-        <w:t xml:space="preserve">Shiny Steelix (Offtank) - T1</w:t>
-      </w:r>
-    </w:p>
-    <w:p>
-      <w:pPr>
-        <w:rPr/>
-      </w:pPr>
-      <w:r>
-        <w:rPr>
-          <w:rtl w:val="0"/>
-        </w:rPr>
-        <w:t xml:space="preserve">Torterra - T1</w:t>
-      </w:r>
-    </w:p>
-    <w:p>
-      <w:pPr>
-        <w:rPr/>
-      </w:pPr>
-      <w:r>
-        <w:rPr>
-          <w:rtl w:val="0"/>
-        </w:rPr>
-        <w:t xml:space="preserve">Shiny Camerupt - T1</w:t>
-      </w:r>
-    </w:p>
-    <w:p>
-      <w:pPr>
-        <w:rPr/>
-      </w:pPr>
-      <w:r>
-        <w:rPr>
-          <w:rtl w:val="0"/>
-        </w:rPr>
-        <w:t xml:space="preserve">Shiny Whiscash - T1</w:t>
-      </w:r>
-    </w:p>
-    <w:p>
-      <w:pPr>
-        <w:rPr/>
-      </w:pPr>
-      <w:r>
-        <w:rPr>
-          <w:rtl w:val="0"/>
-        </w:rPr>
-        <w:t xml:space="preserve">Shiny Torterra - SR</w:t>
-      </w:r>
-    </w:p>
-    <w:p>
-      <w:pPr>
-        <w:rPr/>
-      </w:pPr>
-      <w:r>
-        <w:rPr>
-          <w:rtl w:val="0"/>
-        </w:rPr>
-        <w:t xml:space="preserve">Shiny Pupitar - SR</w:t>
-      </w:r>
-    </w:p>
-    <w:p>
-      <w:pPr>
-        <w:rPr/>
-      </w:pPr>
-      <w:r>
-        <w:rPr>
-          <w:rtl w:val="0"/>
-        </w:rPr>
-      </w:r>
-    </w:p>
-    <w:p>
-      <w:pPr>
-        <w:rPr/>
-      </w:pPr>
-      <w:r>
-        <w:rPr>
-          <w:rtl w:val="0"/>
-        </w:rPr>
-      </w:r>
-    </w:p>
-    <w:p>
-      <w:pPr>
-        <w:rPr/>
-      </w:pPr>
-      <w:r>
-        <w:rPr>
-          <w:rtl w:val="0"/>
-        </w:rPr>
-        <w:t xml:space="preserve">GELO</w:t>
-      </w:r>
-    </w:p>
-    <w:p>
-      <w:pPr>
-        <w:rPr/>
-      </w:pPr>
-      <w:r>
-        <w:rPr>
-          <w:rtl w:val="0"/>
-        </w:rPr>
-      </w:r>
-    </w:p>
-    <w:p>
-      <w:pPr>
-        <w:rPr/>
-      </w:pPr>
-      <w:r>
-        <w:rPr>
-          <w:rtl w:val="0"/>
-        </w:rPr>
-        <w:t xml:space="preserve">Shiny Lapras (Offtank) - T1</w:t>
-      </w:r>
-    </w:p>
-    <w:p>
-      <w:pPr>
-        <w:rPr/>
-      </w:pPr>
-      <w:r>
-        <w:rPr>
-          <w:rtl w:val="0"/>
-        </w:rPr>
-        <w:t xml:space="preserve">Shiny Jynx - T1</w:t>
-      </w:r>
-    </w:p>
-    <w:p>
-      <w:pPr>
-        <w:rPr/>
-      </w:pPr>
-      <w:r>
-        <w:rPr>
-          <w:rtl w:val="0"/>
-        </w:rPr>
-        <w:t xml:space="preserve">Shiny Hitmonchan - T1</w:t>
-      </w:r>
-    </w:p>
-    <w:p>
-      <w:pPr>
-        <w:rPr/>
-      </w:pPr>
-      <w:r>
-        <w:rPr>
-          <w:rtl w:val="0"/>
-        </w:rPr>
         <w:t xml:space="preserve">Shiny Walrein - SR</w:t>
       </w:r>
     </w:p>
@@ -1251,7 +1298,7 @@
         <w:rPr>
           <w:rtl w:val="0"/>
         </w:rPr>
-        <w:t xml:space="preserve">Time inicial: VENENO</w:t>
+        <w:t xml:space="preserve">Time inicial: VENENO </w:t>
       </w:r>
     </w:p>
     <w:p>
@@ -1327,28 +1374,28 @@
         <w:rPr>
           <w:rtl w:val="0"/>
         </w:rPr>
-        <w:t xml:space="preserve">shiny dustox t1 (testar) ou garbordor nomal</w:t>
-      </w:r>
-    </w:p>
-    <w:p>
-      <w:pPr>
-        <w:rPr/>
-      </w:pPr>
-      <w:r>
-        <w:rPr>
-          <w:rtl w:val="0"/>
-        </w:rPr>
-      </w:r>
-    </w:p>
-    <w:p>
-      <w:pPr>
-        <w:rPr/>
-      </w:pPr>
-      <w:r>
-        <w:rPr>
-          <w:rtl w:val="0"/>
-        </w:rPr>
-        <w:t xml:space="preserve">Time inicial: PSIQUICO</w:t>
+        <w:t xml:space="preserve">shiny dustox t1 (testar) ou garbordor nomal t2</w:t>
+      </w:r>
+    </w:p>
+    <w:p>
+      <w:pPr>
+        <w:rPr/>
+      </w:pPr>
+      <w:r>
+        <w:rPr>
+          <w:rtl w:val="0"/>
+        </w:rPr>
+      </w:r>
+    </w:p>
+    <w:p>
+      <w:pPr>
+        <w:rPr/>
+      </w:pPr>
+      <w:r>
+        <w:rPr>
+          <w:rtl w:val="0"/>
+        </w:rPr>
+        <w:t xml:space="preserve">Time inicial: PSIQUICO   É BOMBA FALTA POKE PURO</w:t>
       </w:r>
     </w:p>
     <w:p>
@@ -1455,6 +1502,86 @@
         <w:rPr>
           <w:rtl w:val="0"/>
         </w:rPr>
+      </w:r>
+    </w:p>
+    <w:p>
+      <w:pPr>
+        <w:rPr/>
+      </w:pPr>
+      <w:r>
+        <w:rPr>
+          <w:rtl w:val="0"/>
+        </w:rPr>
+      </w:r>
+    </w:p>
+    <w:p>
+      <w:pPr>
+        <w:rPr/>
+      </w:pPr>
+      <w:r>
+        <w:rPr>
+          <w:rtl w:val="0"/>
+        </w:rPr>
+      </w:r>
+    </w:p>
+    <w:p>
+      <w:pPr>
+        <w:rPr/>
+      </w:pPr>
+      <w:r>
+        <w:rPr>
+          <w:rtl w:val="0"/>
+        </w:rPr>
+      </w:r>
+    </w:p>
+    <w:p>
+      <w:pPr>
+        <w:rPr/>
+      </w:pPr>
+      <w:r>
+        <w:rPr>
+          <w:rtl w:val="0"/>
+        </w:rPr>
+      </w:r>
+    </w:p>
+    <w:p>
+      <w:pPr>
+        <w:rPr/>
+      </w:pPr>
+      <w:r>
+        <w:rPr>
+          <w:rtl w:val="0"/>
+        </w:rPr>
+      </w:r>
+    </w:p>
+    <w:p>
+      <w:pPr>
+        <w:rPr/>
+      </w:pPr>
+      <w:r>
+        <w:rPr>
+          <w:rtl w:val="0"/>
+        </w:rPr>
+      </w:r>
+    </w:p>
+    <w:p>
+      <w:pPr>
+        <w:rPr/>
+      </w:pPr>
+      <w:r>
+        <w:rPr>
+          <w:rtl w:val="0"/>
+        </w:rPr>
+      </w:r>
+    </w:p>
+    <w:p>
+      <w:pPr>
+        <w:rPr/>
+      </w:pPr>
+      <w:r>
+        <w:rPr>
+          <w:rtl w:val="0"/>
+        </w:rPr>
         <w:t xml:space="preserve">ROCK qlqr coisa funciona</w:t>
       </w:r>
     </w:p>
@@ -1915,7 +2042,67 @@
         <w:rPr>
           <w:rtl w:val="0"/>
         </w:rPr>
-        <w:t xml:space="preserve">INSETO</w:t>
+      </w:r>
+    </w:p>
+    <w:p>
+      <w:pPr>
+        <w:rPr/>
+      </w:pPr>
+      <w:r>
+        <w:rPr>
+          <w:rtl w:val="0"/>
+        </w:rPr>
+      </w:r>
+    </w:p>
+    <w:p>
+      <w:pPr>
+        <w:rPr/>
+      </w:pPr>
+      <w:r>
+        <w:rPr>
+          <w:rtl w:val="0"/>
+        </w:rPr>
+      </w:r>
+    </w:p>
+    <w:p>
+      <w:pPr>
+        <w:rPr/>
+      </w:pPr>
+      <w:r>
+        <w:rPr>
+          <w:rtl w:val="0"/>
+        </w:rPr>
+      </w:r>
+    </w:p>
+    <w:p>
+      <w:pPr>
+        <w:rPr/>
+      </w:pPr>
+      <w:r>
+        <w:rPr>
+          <w:rtl w:val="0"/>
+        </w:rPr>
+      </w:r>
+    </w:p>
+    <w:p>
+      <w:pPr>
+        <w:rPr/>
+      </w:pPr>
+      <w:r>
+        <w:rPr>
+          <w:rtl w:val="0"/>
+        </w:rPr>
+      </w:r>
+    </w:p>
+    <w:p>
+      <w:pPr>
+        <w:rPr/>
+      </w:pPr>
+      <w:r>
+        <w:rPr>
+          <w:rtl w:val="0"/>
+        </w:rPr>
+        <w:t xml:space="preserve">INSETO falta mt poke nao tem rotaçao</w:t>
       </w:r>
     </w:p>
     <w:p>
@@ -1957,7 +2144,27 @@
         <w:rPr>
           <w:rtl w:val="0"/>
         </w:rPr>
-        <w:t xml:space="preserve">dragao</w:t>
+      </w:r>
+    </w:p>
+    <w:p>
+      <w:pPr>
+        <w:rPr/>
+      </w:pPr>
+      <w:r>
+        <w:rPr>
+          <w:rtl w:val="0"/>
+        </w:rPr>
+      </w:r>
+    </w:p>
+    <w:p>
+      <w:pPr>
+        <w:rPr/>
+      </w:pPr>
+      <w:r>
+        <w:rPr>
+          <w:rtl w:val="0"/>
+        </w:rPr>
+        <w:t xml:space="preserve">dragao vao dar soluçao em breve </w:t>
       </w:r>
     </w:p>
     <w:p>

</xml_diff>